<commit_message>
fix(brand): lock designer logo masters
</commit_message>
<xml_diff>
--- a/artifacts/blind-build/maslow-workflow-proposal.docx
+++ b/artifacts/blind-build/maslow-workflow-proposal.docx
@@ -622,7 +622,7 @@
         <w:color w:val="666666"/>
         <w:sz w:val="16"/>
       </w:rPr>
-      <w:t xml:space="preserve">MASLOW BRAND OS 1.0.0 · </w:t>
+      <w:t xml:space="preserve">MASLOW BRAND OS 1.0.1 · </w:t>
     </w:r>
     <w:r>
       <w:rPr>
@@ -762,8 +762,8 @@
       </w:tblBorders>
     </w:tblPr>
     <w:tblGrid>
-      <w:gridCol w:w="1584"/>
-      <w:gridCol w:w="8352"/>
+      <w:gridCol w:w="2592"/>
+      <w:gridCol w:w="7343"/>
     </w:tblGrid>
     <w:tr>
       <w:trPr>
@@ -771,7 +771,7 @@
       </w:trPr>
       <w:tc>
         <w:tcPr>
-          <w:tcW w:type="dxa" w:w="1584"/>
+          <w:tcW w:type="dxa" w:w="2592"/>
           <w:tcMar>
             <w:top w:w="80" w:type="dxa"/>
             <w:start w:w="120" w:type="dxa"/>
@@ -783,8 +783,8 @@
           <w:r>
             <w:drawing>
               <wp:inline xmlns:a="http://schemas.openxmlformats.org/drawingml/2006/main" xmlns:pic="http://schemas.openxmlformats.org/drawingml/2006/picture">
-                <wp:extent cx="438912" cy="292217"/>
-                <wp:docPr id="1" name="Picture 1" descr="Maslow AI mark" title="Maslow AI mark"/>
+                <wp:extent cx="1463040" cy="232365"/>
+                <wp:docPr id="1" name="Picture 1" descr="Maslow AI complete full-color logo" title="Maslow AI complete full-color logo"/>
                 <wp:cNvGraphicFramePr>
                   <a:graphicFrameLocks noChangeAspect="1"/>
                 </wp:cNvGraphicFramePr>
@@ -792,7 +792,7 @@
                   <a:graphicData uri="http://schemas.openxmlformats.org/drawingml/2006/picture">
                     <pic:pic>
                       <pic:nvPicPr>
-                        <pic:cNvPr id="0" name="maslow-mark-ink.png"/>
+                        <pic:cNvPr id="0" name="maslow-complete-full-color.png"/>
                         <pic:cNvPicPr/>
                       </pic:nvPicPr>
                       <pic:blipFill>
@@ -804,7 +804,7 @@
                       <pic:spPr>
                         <a:xfrm>
                           <a:off x="0" y="0"/>
-                          <a:ext cx="438912" cy="292217"/>
+                          <a:ext cx="1463040" cy="232365"/>
                         </a:xfrm>
                         <a:prstGeom prst="rect"/>
                       </pic:spPr>
@@ -818,7 +818,7 @@
       </w:tc>
       <w:tc>
         <w:tcPr>
-          <w:tcW w:type="dxa" w:w="8352"/>
+          <w:tcW w:type="dxa" w:w="7343"/>
           <w:tcMar>
             <w:top w:w="80" w:type="dxa"/>
             <w:start w:w="120" w:type="dxa"/>

</xml_diff>